<commit_message>
Fix docx and pdf files
</commit_message>
<xml_diff>
--- a/TH/lab6/report/MSSV_LABx.docx
+++ b/TH/lab6/report/MSSV_LABx.docx
@@ -2190,23 +2190,7 @@
             <w:sz w:val="26"/>
             <w:szCs w:val="26"/>
           </w:rPr>
-          <w:t>https://github.com/VuDaiDuong-23520359/OS_ubuntu/blob/DesktopUIT/TH/lab6/ma</w:t>
-        </w:r>
-        <w:r>
-          <w:rPr>
-            <w:rStyle w:val="Hyperlink"/>
-            <w:sz w:val="26"/>
-            <w:szCs w:val="26"/>
-          </w:rPr>
-          <w:t>i</w:t>
-        </w:r>
-        <w:r>
-          <w:rPr>
-            <w:rStyle w:val="Hyperlink"/>
-            <w:sz w:val="26"/>
-            <w:szCs w:val="26"/>
-          </w:rPr>
-          <w:t>n.c</w:t>
+          <w:t>https://github.com/VuDaiDuong-23520359/OS_ubuntu/blob/DesktopUIT/TH/lab6/main.c</w:t>
         </w:r>
       </w:hyperlink>
     </w:p>
@@ -5845,7 +5829,21 @@
           <w:i/>
           <w:iCs/>
         </w:rPr>
-        <w:t>Hình 27: Kết quả chạy lệnh tail -f vuduylab6.txt khi không có hàm xử lý signal</w:t>
+        <w:t>Hình 27: Kết quả chạy lệnh tail -f v</w:t>
+      </w:r>
+      <w:r>
+        <w:rPr>
+          <w:i/>
+          <w:iCs/>
+        </w:rPr>
+        <w:t>duong</w:t>
+      </w:r>
+      <w:r>
+        <w:rPr>
+          <w:i/>
+          <w:iCs/>
+        </w:rPr>
+        <w:t>.txt khi không có hàm xử lý signal</w:t>
       </w:r>
     </w:p>
     <w:p>
@@ -5918,7 +5916,21 @@
           <w:i/>
           <w:iCs/>
         </w:rPr>
-        <w:t>Hình 28: Kết quả chạy lệnh tail -f vuduylab6.txt khi có hàm xử lý signal</w:t>
+        <w:t>Hình 28: Kết quả chạy lệnh tail -f v</w:t>
+      </w:r>
+      <w:r>
+        <w:rPr>
+          <w:i/>
+          <w:iCs/>
+        </w:rPr>
+        <w:t>duong</w:t>
+      </w:r>
+      <w:r>
+        <w:rPr>
+          <w:i/>
+          <w:iCs/>
+        </w:rPr>
+        <w:t>.txt khi có hàm xử lý signal</w:t>
       </w:r>
     </w:p>
     <w:sectPr>
@@ -6038,7 +6050,7 @@
     <mc:AlternateContent>
       <mc:Choice Requires="v">
         <w:pict>
-          <v:shapetype w14:anchorId="6EF77033" id="_x0000_t75" coordsize="21600,21600" o:spt="75" o:preferrelative="t" path="m@4@5l@4@11@9@11@9@5xe" filled="f" stroked="f">
+          <v:shapetype w14:anchorId="46313DBF" id="_x0000_t75" coordsize="21600,21600" o:spt="75" o:preferrelative="t" path="m@4@5l@4@11@9@11@9@5xe" filled="f" stroked="f">
             <v:stroke joinstyle="miter"/>
             <v:formulas>
               <v:f eqn="if lineDrawn pixelLineWidth 0"/>
@@ -6064,10 +6076,10 @@
       </mc:Choice>
       <mc:Fallback>
         <w:drawing>
-          <wp:inline distT="0" distB="0" distL="0" distR="0" wp14:anchorId="60E3E222" wp14:editId="2167139C">
+          <wp:inline distT="0" distB="0" distL="0" distR="0" wp14:anchorId="782D3DF2" wp14:editId="7AAE6A7E">
             <wp:extent cx="142875" cy="142875"/>
             <wp:effectExtent l="0" t="0" r="9525" b="9525"/>
-            <wp:docPr id="2114114068" name="Picture 1" descr="C:\Users\ASUS\AppData\Local\Temp\mso241.tmp"/>
+            <wp:docPr id="847832151" name="Picture 1" descr="C:\Users\ASUS\AppData\Local\Temp\mso241.tmp"/>
             <wp:cNvGraphicFramePr>
               <a:graphicFrameLocks xmlns:a="http://schemas.openxmlformats.org/drawingml/2006/main" noChangeAspect="1"/>
             </wp:cNvGraphicFramePr>

</xml_diff>